<commit_message>
v1.13.4: Drop the Spectrum name from descriptive text; rebuild 49 stale docx
</commit_message>
<xml_diff>
--- a/docs/AtoM_Heratio_AI_Condition_Assessment.docx
+++ b/docs/AtoM_Heratio_AI_Condition_Assessment.docx
@@ -18,32 +18,6 @@
         <w:t xml:space="preserve">The Archive and Heritage Group (Pty) Ltd</w:t>
       </w:r>
     </w:p>
-    <w:sdt>
-      <w:sdtPr>
-        <w:docPartObj>
-          <w:docPartGallery w:val="Table of Contents"/>
-          <w:docPartUnique/>
-        </w:docPartObj>
-      </w:sdtPr>
-      <w:sdtContent>
-        <w:p>
-          <w:pPr>
-            <w:pStyle w:val="TOCHeading"/>
-          </w:pPr>
-          <w:r>
-            <w:t xml:space="preserve">Table of Contents</w:t>
-          </w:r>
-        </w:p>
-        <w:p>
-          <w:r>
-            <w:fldChar w:fldCharType="begin" w:dirty="true"/>
-            <w:instrText xml:space="preserve">TOC \o "1-3" \h \z \u</w:instrText>
-            <w:fldChar w:fldCharType="separate"/>
-            <w:fldChar w:fldCharType="end"/>
-          </w:r>
-        </w:p>
-      </w:sdtContent>
-    </w:sdt>
     <w:bookmarkStart w:id="38" w:name="atom-heratio-ai-condition-assessment"/>
     <w:p>
       <w:pPr>
@@ -155,166 +129,145 @@
     </w:p>
     <w:p>
       <w:pPr>
-        <w:pStyle w:val="SourceCode"/>
-      </w:pPr>
-      <w:r>
-        <w:rPr>
-          <w:rStyle w:val="VerbatimChar"/>
-        </w:rPr>
-        <w:t xml:space="preserve">┌──────────────┐     ┌──────────────┐     ┌──────────────────────┐</w:t>
-      </w:r>
-      <w:r>
-        <w:br/>
-      </w:r>
-      <w:r>
-        <w:rPr>
-          <w:rStyle w:val="VerbatimChar"/>
-        </w:rPr>
-        <w:t xml:space="preserve">│  Condition    │     │   Ollama     │     │  Database             │</w:t>
-      </w:r>
-      <w:r>
-        <w:br/>
-      </w:r>
-      <w:r>
-        <w:rPr>
-          <w:rStyle w:val="VerbatimChar"/>
-        </w:rPr>
-        <w:t xml:space="preserve">│  Photo        │────&gt;│   LLaVA:7b   │────&gt;│  spectrum_condition_  │</w:t>
-      </w:r>
-      <w:r>
-        <w:br/>
-      </w:r>
-      <w:r>
-        <w:rPr>
-          <w:rStyle w:val="VerbatimChar"/>
-        </w:rPr>
-        <w:t xml:space="preserve">│  (uploaded)   │     │  (local LLM) │     │  check + condition_   │</w:t>
-      </w:r>
-      <w:r>
-        <w:br/>
-      </w:r>
-      <w:r>
-        <w:rPr>
-          <w:rStyle w:val="VerbatimChar"/>
-        </w:rPr>
-        <w:t xml:space="preserve">│               │     │              │     │  damage               │</w:t>
-      </w:r>
-      <w:r>
-        <w:br/>
-      </w:r>
-      <w:r>
-        <w:rPr>
-          <w:rStyle w:val="VerbatimChar"/>
-        </w:rPr>
-        <w:t xml:space="preserve">└──────────────┘     └──────────────┘     └──────────────────────┘</w:t>
-      </w:r>
-      <w:r>
-        <w:br/>
-      </w:r>
-      <w:r>
-        <w:rPr>
-          <w:rStyle w:val="VerbatimChar"/>
-        </w:rPr>
-        <w:t xml:space="preserve">       │                    │                       │</w:t>
-      </w:r>
-      <w:r>
-        <w:br/>
-      </w:r>
-      <w:r>
-        <w:rPr>
-          <w:rStyle w:val="VerbatimChar"/>
-        </w:rPr>
-        <w:t xml:space="preserve">       │              Conservation-            Structured:</w:t>
-      </w:r>
-      <w:r>
-        <w:br/>
-      </w:r>
-      <w:r>
-        <w:rPr>
-          <w:rStyle w:val="VerbatimChar"/>
-        </w:rPr>
-        <w:t xml:space="preserve">       │              specific prompt          • Rating</w:t>
-      </w:r>
-      <w:r>
-        <w:br/>
-      </w:r>
-      <w:r>
-        <w:rPr>
-          <w:rStyle w:val="VerbatimChar"/>
-        </w:rPr>
-        <w:t xml:space="preserve">       │              with material            • Severity</w:t>
-      </w:r>
-      <w:r>
-        <w:br/>
-      </w:r>
-      <w:r>
-        <w:rPr>
-          <w:rStyle w:val="VerbatimChar"/>
-        </w:rPr>
-        <w:t xml:space="preserve">       │              type hint                • Damage types</w:t>
-      </w:r>
-      <w:r>
-        <w:br/>
-      </w:r>
-      <w:r>
-        <w:rPr>
-          <w:rStyle w:val="VerbatimChar"/>
-        </w:rPr>
-        <w:t xml:space="preserve">       │                                       • Description</w:t>
-      </w:r>
-      <w:r>
-        <w:br/>
-      </w:r>
-      <w:r>
-        <w:rPr>
-          <w:rStyle w:val="VerbatimChar"/>
-        </w:rPr>
-        <w:t xml:space="preserve">       │                                       • Recommendations</w:t>
-      </w:r>
-      <w:r>
-        <w:br/>
-      </w:r>
-      <w:r>
-        <w:rPr>
-          <w:rStyle w:val="VerbatimChar"/>
-        </w:rPr>
-        <w:t xml:space="preserve">       ▼</w:t>
-      </w:r>
-      <w:r>
-        <w:br/>
-      </w:r>
-      <w:r>
-        <w:rPr>
-          <w:rStyle w:val="VerbatimChar"/>
-        </w:rPr>
-        <w:t xml:space="preserve">┌──────────────────────────────────────────────────────────┐</w:t>
-      </w:r>
-      <w:r>
-        <w:br/>
-      </w:r>
-      <w:r>
-        <w:rPr>
-          <w:rStyle w:val="VerbatimChar"/>
-        </w:rPr>
-        <w:t xml:space="preserve">│  UI: Rating badge, Severity badge, Damage list,          │</w:t>
-      </w:r>
-      <w:r>
-        <w:br/>
-      </w:r>
-      <w:r>
-        <w:rPr>
-          <w:rStyle w:val="VerbatimChar"/>
-        </w:rPr>
-        <w:t xml:space="preserve">│       Recommendations, link to full condition check      │</w:t>
-      </w:r>
-      <w:r>
-        <w:br/>
-      </w:r>
-      <w:r>
-        <w:rPr>
-          <w:rStyle w:val="VerbatimChar"/>
-        </w:rPr>
-        <w:t xml:space="preserve">└──────────────────────────────────────────────────────────┘</w:t>
+        <w:pStyle w:val="FirstParagraph"/>
+      </w:pPr>
+      <w:r>
+        <w:t xml:space="preserve">Condition</w:t>
+      </w:r>
+      <w:r>
+        <w:t xml:space="preserve">Ollama</w:t>
+      </w:r>
+      <w:r>
+        <w:t xml:space="preserve">Database</w:t>
+      </w:r>
+      <w:r>
+        <w:t xml:space="preserve">Photo</w:t>
+      </w:r>
+      <w:r>
+        <w:t xml:space="preserve">&gt;</w:t>
+      </w:r>
+      <w:r>
+        <w:t xml:space="preserve">LLaVA:7b</w:t>
+      </w:r>
+      <w:r>
+        <w:t xml:space="preserve">&gt;</w:t>
+      </w:r>
+      <w:r>
+        <w:t xml:space="preserve">spectrum_condition_</w:t>
+      </w:r>
+      <w:r>
+        <w:t xml:space="preserve">(uploaded)</w:t>
+      </w:r>
+      <w:r>
+        <w:t xml:space="preserve">(local</w:t>
+      </w:r>
+      <w:r>
+        <w:t xml:space="preserve">LLM)</w:t>
+      </w:r>
+      <w:r>
+        <w:t xml:space="preserve">check</w:t>
+      </w:r>
+      <w:r>
+        <w:t xml:space="preserve">condition_</w:t>
+      </w:r>
+      <w:r>
+        <w:t xml:space="preserve">damage</w:t>
+      </w:r>
+      <w:r>
+        <w:t xml:space="preserve">Conservation-</w:t>
+      </w:r>
+      <w:r>
+        <w:t xml:space="preserve">Structured:</w:t>
+      </w:r>
+      <w:r>
+        <w:t xml:space="preserve">specific</w:t>
+      </w:r>
+      <w:r>
+        <w:t xml:space="preserve">prompt</w:t>
+      </w:r>
+      <w:r>
+        <w:t xml:space="preserve">•</w:t>
+      </w:r>
+      <w:r>
+        <w:t xml:space="preserve">Rating</w:t>
+      </w:r>
+      <w:r>
+        <w:t xml:space="preserve">with</w:t>
+      </w:r>
+      <w:r>
+        <w:t xml:space="preserve">material</w:t>
+      </w:r>
+      <w:r>
+        <w:t xml:space="preserve">•</w:t>
+      </w:r>
+      <w:r>
+        <w:t xml:space="preserve">Severity</w:t>
+      </w:r>
+      <w:r>
+        <w:t xml:space="preserve">type</w:t>
+      </w:r>
+      <w:r>
+        <w:t xml:space="preserve">hint</w:t>
+      </w:r>
+      <w:r>
+        <w:t xml:space="preserve">•</w:t>
+      </w:r>
+      <w:r>
+        <w:t xml:space="preserve">Damage</w:t>
+      </w:r>
+      <w:r>
+        <w:t xml:space="preserve">types</w:t>
+      </w:r>
+      <w:r>
+        <w:t xml:space="preserve">•</w:t>
+      </w:r>
+      <w:r>
+        <w:t xml:space="preserve">Description</w:t>
+      </w:r>
+      <w:r>
+        <w:t xml:space="preserve">•</w:t>
+      </w:r>
+      <w:r>
+        <w:t xml:space="preserve">Recommendations</w:t>
+      </w:r>
+      <w:r>
+        <w:t xml:space="preserve">UI:</w:t>
+      </w:r>
+      <w:r>
+        <w:t xml:space="preserve">Rating</w:t>
+      </w:r>
+      <w:r>
+        <w:t xml:space="preserve">badge,</w:t>
+      </w:r>
+      <w:r>
+        <w:t xml:space="preserve">Severity</w:t>
+      </w:r>
+      <w:r>
+        <w:t xml:space="preserve">badge,</w:t>
+      </w:r>
+      <w:r>
+        <w:t xml:space="preserve">Damage</w:t>
+      </w:r>
+      <w:r>
+        <w:t xml:space="preserve">list,</w:t>
+      </w:r>
+      <w:r>
+        <w:t xml:space="preserve">Recommendations,</w:t>
+      </w:r>
+      <w:r>
+        <w:t xml:space="preserve">link</w:t>
+      </w:r>
+      <w:r>
+        <w:t xml:space="preserve">to</w:t>
+      </w:r>
+      <w:r>
+        <w:t xml:space="preserve">full</w:t>
+      </w:r>
+      <w:r>
+        <w:t xml:space="preserve">condition</w:t>
+      </w:r>
+      <w:r>
+        <w:t xml:space="preserve">check</w:t>
       </w:r>
     </w:p>
     <w:bookmarkEnd w:id="21"/>
@@ -440,7 +393,7 @@
         <w:pStyle w:val="FirstParagraph"/>
       </w:pPr>
       <w:r>
-        <w:t xml:space="preserve">15 Spectrum 5.1 damage types with 30+ synonym mappings:</w:t>
+        <w:t xml:space="preserve">15 Collections Procedures damage types with 30+ synonym mappings:</w:t>
       </w:r>
     </w:p>
     <w:tbl>

</xml_diff>